<commit_message>
feat: dynamic sheet-driven risk percentage and documentation synchronization
</commit_message>
<xml_diff>
--- a/NSE_Dual_System_Master_Comprehensive_Manual.docx
+++ b/NSE_Dual_System_Master_Comprehensive_Manual.docx
@@ -1002,7 +1002,7 @@
                 <w:color w:val="222222"/>
                 <w:sz w:val="18"/>
               </w:rPr>
-              <w:t>Capital Risk per Trade</w:t>
+              <w:t>Active Portfolio Value</w:t>
             </w:r>
           </w:p>
         </w:tc>
@@ -1027,7 +1027,7 @@
                 <w:color w:val="222222"/>
                 <w:sz w:val="18"/>
               </w:rPr>
-              <w:t>1.0% of Total Portfolio Value</w:t>
+              <w:t>₹100,000.00 (Sheet-Driven)</w:t>
             </w:r>
           </w:p>
         </w:tc>
@@ -1052,7 +1052,7 @@
                 <w:color w:val="222222"/>
                 <w:sz w:val="18"/>
               </w:rPr>
-              <w:t>1.5% of Total Portfolio Value</w:t>
+              <w:t>₹100,000.00 (Sheet-Driven)</w:t>
             </w:r>
           </w:p>
         </w:tc>
@@ -1079,7 +1079,7 @@
                 <w:color w:val="222222"/>
                 <w:sz w:val="18"/>
               </w:rPr>
-              <w:t>Initial Stop Loss</w:t>
+              <w:t>Active Capital Risk per Trade</w:t>
             </w:r>
           </w:p>
         </w:tc>
@@ -1104,7 +1104,7 @@
                 <w:color w:val="222222"/>
                 <w:sz w:val="18"/>
               </w:rPr>
-              <w:t>Breakout 20 SMA (Clamped 3% – 15%)</w:t>
+              <w:t>5.0% (Configured in Account)</w:t>
             </w:r>
           </w:p>
         </w:tc>
@@ -1129,7 +1129,7 @@
                 <w:color w:val="222222"/>
                 <w:sz w:val="18"/>
               </w:rPr>
-              <w:t>Volatility-Adaptive 2x ATR(14) (Clamped to 20 SMA)</w:t>
+              <w:t>7.5% (Configured in Account)</w:t>
             </w:r>
           </w:p>
         </w:tc>
@@ -1156,7 +1156,7 @@
                 <w:color w:val="222222"/>
                 <w:sz w:val="18"/>
               </w:rPr>
-              <w:t>Sector Diversification</w:t>
+              <w:t>Active Risk Amount per Trade</w:t>
             </w:r>
           </w:p>
         </w:tc>
@@ -1181,7 +1181,7 @@
                 <w:color w:val="222222"/>
                 <w:sz w:val="18"/>
               </w:rPr>
-              <w:t>Standard Portfolio Allocation</w:t>
+              <w:t>₹5,000.00 (₹100,000 x 0.05)</w:t>
             </w:r>
           </w:p>
         </w:tc>
@@ -1206,7 +1206,7 @@
                 <w:color w:val="222222"/>
                 <w:sz w:val="18"/>
               </w:rPr>
-              <w:t>Max 3 open positions per economic sector</w:t>
+              <w:t>₹7,500.00 (₹100,000 x 0.075)</w:t>
             </w:r>
           </w:p>
         </w:tc>
@@ -1233,7 +1233,7 @@
                 <w:color w:val="222222"/>
                 <w:sz w:val="18"/>
               </w:rPr>
-              <w:t>Profit Target</w:t>
+              <w:t>Risk Sizing Formulation</w:t>
             </w:r>
           </w:p>
         </w:tc>
@@ -1258,7 +1258,7 @@
                 <w:color w:val="222222"/>
                 <w:sz w:val="18"/>
               </w:rPr>
-              <w:t>1:2 Risk-to-Reward Ratio</w:t>
+              <w:t>floor((Portfolio * Risk_Percent) / (Entry - SL))</w:t>
             </w:r>
           </w:p>
         </w:tc>
@@ -1283,7 +1283,7 @@
                 <w:color w:val="222222"/>
                 <w:sz w:val="18"/>
               </w:rPr>
-              <w:t>1:2 Risk-to-Reward Ratio</w:t>
+              <w:t>floor((Portfolio * Risk_Percent) / (2 * ATR(14)))</w:t>
             </w:r>
           </w:p>
         </w:tc>
@@ -1310,7 +1310,7 @@
                 <w:color w:val="222222"/>
                 <w:sz w:val="18"/>
               </w:rPr>
-              <w:t>Trailing Stop Loss</w:t>
+              <w:t>Initial Stop Loss</w:t>
             </w:r>
           </w:p>
         </w:tc>
@@ -1335,7 +1335,7 @@
                 <w:color w:val="222222"/>
                 <w:sz w:val="18"/>
               </w:rPr>
-              <w:t>Dynamic 20 EMA (Ratchets Up Only)</w:t>
+              <w:t>Breakout 20 SMA (Clamped 3% – 15%)</w:t>
             </w:r>
           </w:p>
         </w:tc>
@@ -1360,7 +1360,7 @@
                 <w:color w:val="222222"/>
                 <w:sz w:val="18"/>
               </w:rPr>
-              <w:t>Dynamic 20 EMA (Ratchets Up Only)</w:t>
+              <w:t>Volatility-Adaptive 2x ATR(14) (Clamped to 20 SMA)</w:t>
             </w:r>
           </w:p>
         </w:tc>
@@ -1387,7 +1387,7 @@
                 <w:color w:val="222222"/>
                 <w:sz w:val="18"/>
               </w:rPr>
-              <w:t>3-Year Backtest Return</w:t>
+              <w:t>Sector Diversification</w:t>
             </w:r>
           </w:p>
         </w:tc>
@@ -1412,7 +1412,7 @@
                 <w:color w:val="222222"/>
                 <w:sz w:val="18"/>
               </w:rPr>
-              <w:t>+35.62% (+11.90% Alpha over Nifty)</w:t>
+              <w:t>Standard Portfolio Allocation</w:t>
             </w:r>
           </w:p>
         </w:tc>
@@ -1420,6 +1420,237 @@
           <w:tcPr>
             <w:tcW w:type="dxa" w:w="3312"/>
             <w:shd w:fill="F7F9FB"/>
+            <w:tcMar>
+              <w:top w:w="80" w:type="dxa"/>
+              <w:bottom w:w="80" w:type="dxa"/>
+              <w:left w:w="140" w:type="dxa"/>
+              <w:right w:w="140" w:type="dxa"/>
+            </w:tcMar>
+          </w:tcPr>
+          <w:p>
+            <w:pPr>
+              <w:spacing w:before="40" w:after="40" w:line="269" w:lineRule="auto"/>
+            </w:pPr>
+            <w:r>
+              <w:rPr>
+                <w:rFonts w:ascii="Calibri" w:hAnsi="Calibri"/>
+                <w:color w:val="222222"/>
+                <w:sz w:val="18"/>
+              </w:rPr>
+              <w:t>Max 3 open positions per economic sector</w:t>
+            </w:r>
+          </w:p>
+        </w:tc>
+      </w:tr>
+      <w:tr>
+        <w:tc>
+          <w:tcPr>
+            <w:tcW w:type="dxa" w:w="3168"/>
+            <w:shd w:fill="FFFFFF"/>
+            <w:tcMar>
+              <w:top w:w="80" w:type="dxa"/>
+              <w:bottom w:w="80" w:type="dxa"/>
+              <w:left w:w="140" w:type="dxa"/>
+              <w:right w:w="140" w:type="dxa"/>
+            </w:tcMar>
+          </w:tcPr>
+          <w:p>
+            <w:pPr>
+              <w:spacing w:before="40" w:after="40" w:line="269" w:lineRule="auto"/>
+            </w:pPr>
+            <w:r>
+              <w:rPr>
+                <w:rFonts w:ascii="Calibri" w:hAnsi="Calibri"/>
+                <w:color w:val="222222"/>
+                <w:sz w:val="18"/>
+              </w:rPr>
+              <w:t>Profit Target</w:t>
+            </w:r>
+          </w:p>
+        </w:tc>
+        <w:tc>
+          <w:tcPr>
+            <w:tcW w:type="dxa" w:w="3312"/>
+            <w:shd w:fill="FFFFFF"/>
+            <w:tcMar>
+              <w:top w:w="80" w:type="dxa"/>
+              <w:bottom w:w="80" w:type="dxa"/>
+              <w:left w:w="140" w:type="dxa"/>
+              <w:right w:w="140" w:type="dxa"/>
+            </w:tcMar>
+          </w:tcPr>
+          <w:p>
+            <w:pPr>
+              <w:spacing w:before="40" w:after="40" w:line="269" w:lineRule="auto"/>
+            </w:pPr>
+            <w:r>
+              <w:rPr>
+                <w:rFonts w:ascii="Calibri" w:hAnsi="Calibri"/>
+                <w:color w:val="222222"/>
+                <w:sz w:val="18"/>
+              </w:rPr>
+              <w:t>1:2 Risk-to-Reward Ratio</w:t>
+            </w:r>
+          </w:p>
+        </w:tc>
+        <w:tc>
+          <w:tcPr>
+            <w:tcW w:type="dxa" w:w="3312"/>
+            <w:shd w:fill="FFFFFF"/>
+            <w:tcMar>
+              <w:top w:w="80" w:type="dxa"/>
+              <w:bottom w:w="80" w:type="dxa"/>
+              <w:left w:w="140" w:type="dxa"/>
+              <w:right w:w="140" w:type="dxa"/>
+            </w:tcMar>
+          </w:tcPr>
+          <w:p>
+            <w:pPr>
+              <w:spacing w:before="40" w:after="40" w:line="269" w:lineRule="auto"/>
+            </w:pPr>
+            <w:r>
+              <w:rPr>
+                <w:rFonts w:ascii="Calibri" w:hAnsi="Calibri"/>
+                <w:color w:val="222222"/>
+                <w:sz w:val="18"/>
+              </w:rPr>
+              <w:t>1:2 Risk-to-Reward Ratio</w:t>
+            </w:r>
+          </w:p>
+        </w:tc>
+      </w:tr>
+      <w:tr>
+        <w:tc>
+          <w:tcPr>
+            <w:tcW w:type="dxa" w:w="3168"/>
+            <w:shd w:fill="F7F9FB"/>
+            <w:tcMar>
+              <w:top w:w="80" w:type="dxa"/>
+              <w:bottom w:w="80" w:type="dxa"/>
+              <w:left w:w="140" w:type="dxa"/>
+              <w:right w:w="140" w:type="dxa"/>
+            </w:tcMar>
+          </w:tcPr>
+          <w:p>
+            <w:pPr>
+              <w:spacing w:before="40" w:after="40" w:line="269" w:lineRule="auto"/>
+            </w:pPr>
+            <w:r>
+              <w:rPr>
+                <w:rFonts w:ascii="Calibri" w:hAnsi="Calibri"/>
+                <w:color w:val="222222"/>
+                <w:sz w:val="18"/>
+              </w:rPr>
+              <w:t>Trailing Stop Loss</w:t>
+            </w:r>
+          </w:p>
+        </w:tc>
+        <w:tc>
+          <w:tcPr>
+            <w:tcW w:type="dxa" w:w="3312"/>
+            <w:shd w:fill="F7F9FB"/>
+            <w:tcMar>
+              <w:top w:w="80" w:type="dxa"/>
+              <w:bottom w:w="80" w:type="dxa"/>
+              <w:left w:w="140" w:type="dxa"/>
+              <w:right w:w="140" w:type="dxa"/>
+            </w:tcMar>
+          </w:tcPr>
+          <w:p>
+            <w:pPr>
+              <w:spacing w:before="40" w:after="40" w:line="269" w:lineRule="auto"/>
+            </w:pPr>
+            <w:r>
+              <w:rPr>
+                <w:rFonts w:ascii="Calibri" w:hAnsi="Calibri"/>
+                <w:color w:val="222222"/>
+                <w:sz w:val="18"/>
+              </w:rPr>
+              <w:t>Dynamic 20 EMA (Ratchets Up Only)</w:t>
+            </w:r>
+          </w:p>
+        </w:tc>
+        <w:tc>
+          <w:tcPr>
+            <w:tcW w:type="dxa" w:w="3312"/>
+            <w:shd w:fill="F7F9FB"/>
+            <w:tcMar>
+              <w:top w:w="80" w:type="dxa"/>
+              <w:bottom w:w="80" w:type="dxa"/>
+              <w:left w:w="140" w:type="dxa"/>
+              <w:right w:w="140" w:type="dxa"/>
+            </w:tcMar>
+          </w:tcPr>
+          <w:p>
+            <w:pPr>
+              <w:spacing w:before="40" w:after="40" w:line="269" w:lineRule="auto"/>
+            </w:pPr>
+            <w:r>
+              <w:rPr>
+                <w:rFonts w:ascii="Calibri" w:hAnsi="Calibri"/>
+                <w:color w:val="222222"/>
+                <w:sz w:val="18"/>
+              </w:rPr>
+              <w:t>Dynamic 20 EMA (Ratchets Up Only)</w:t>
+            </w:r>
+          </w:p>
+        </w:tc>
+      </w:tr>
+      <w:tr>
+        <w:tc>
+          <w:tcPr>
+            <w:tcW w:type="dxa" w:w="3168"/>
+            <w:shd w:fill="FFFFFF"/>
+            <w:tcMar>
+              <w:top w:w="80" w:type="dxa"/>
+              <w:bottom w:w="80" w:type="dxa"/>
+              <w:left w:w="140" w:type="dxa"/>
+              <w:right w:w="140" w:type="dxa"/>
+            </w:tcMar>
+          </w:tcPr>
+          <w:p>
+            <w:pPr>
+              <w:spacing w:before="40" w:after="40" w:line="269" w:lineRule="auto"/>
+            </w:pPr>
+            <w:r>
+              <w:rPr>
+                <w:rFonts w:ascii="Calibri" w:hAnsi="Calibri"/>
+                <w:color w:val="222222"/>
+                <w:sz w:val="18"/>
+              </w:rPr>
+              <w:t>3-Year Backtest Return</w:t>
+            </w:r>
+          </w:p>
+        </w:tc>
+        <w:tc>
+          <w:tcPr>
+            <w:tcW w:type="dxa" w:w="3312"/>
+            <w:shd w:fill="FFFFFF"/>
+            <w:tcMar>
+              <w:top w:w="80" w:type="dxa"/>
+              <w:bottom w:w="80" w:type="dxa"/>
+              <w:left w:w="140" w:type="dxa"/>
+              <w:right w:w="140" w:type="dxa"/>
+            </w:tcMar>
+          </w:tcPr>
+          <w:p>
+            <w:pPr>
+              <w:spacing w:before="40" w:after="40" w:line="269" w:lineRule="auto"/>
+            </w:pPr>
+            <w:r>
+              <w:rPr>
+                <w:rFonts w:ascii="Calibri" w:hAnsi="Calibri"/>
+                <w:color w:val="222222"/>
+                <w:sz w:val="18"/>
+              </w:rPr>
+              <w:t>+35.62% (+11.90% Alpha over Nifty)</w:t>
+            </w:r>
+          </w:p>
+        </w:tc>
+        <w:tc>
+          <w:tcPr>
+            <w:tcW w:type="dxa" w:w="3312"/>
+            <w:shd w:fill="FFFFFF"/>
             <w:tcMar>
               <w:top w:w="80" w:type="dxa"/>
               <w:bottom w:w="80" w:type="dxa"/>
@@ -4822,7 +5053,7 @@
         </w:tc>
         <w:tc>
           <w:tcPr>
-            <w:tcW w:type="dxa" w:w="2592"/>
+            <w:tcW w:type="dxa" w:w="3168"/>
             <w:shd w:fill="1B365D"/>
             <w:tcMar>
               <w:top w:w="120" w:type="dxa"/>
@@ -4842,13 +5073,13 @@
                 <w:color w:val="FFFFFF"/>
                 <w:sz w:val="19"/>
               </w:rPr>
-              <w:t>Configured Value</w:t>
+              <w:t>Active Value (Sheet)</w:t>
             </w:r>
           </w:p>
         </w:tc>
         <w:tc>
           <w:tcPr>
-            <w:tcW w:type="dxa" w:w="4320"/>
+            <w:tcW w:type="dxa" w:w="3744"/>
             <w:shd w:fill="1B365D"/>
             <w:tcMar>
               <w:top w:w="120" w:type="dxa"/>
@@ -4868,7 +5099,7 @@
                 <w:color w:val="FFFFFF"/>
                 <w:sz w:val="19"/>
               </w:rPr>
-              <w:t>Description</w:t>
+              <w:t>Description &amp; Dynamic Behavior</w:t>
             </w:r>
           </w:p>
         </w:tc>
@@ -4901,7 +5132,7 @@
         </w:tc>
         <w:tc>
           <w:tcPr>
-            <w:tcW w:type="dxa" w:w="2592"/>
+            <w:tcW w:type="dxa" w:w="3168"/>
             <w:shd w:fill="F7F9FB"/>
             <w:tcMar>
               <w:top w:w="80" w:type="dxa"/>
@@ -4920,13 +5151,13 @@
                 <w:color w:val="222222"/>
                 <w:sz w:val="18"/>
               </w:rPr>
-              <w:t>₹1,000,000.00</w:t>
+              <w:t>₹100,000.00 (Active)</w:t>
             </w:r>
           </w:p>
         </w:tc>
         <w:tc>
           <w:tcPr>
-            <w:tcW w:type="dxa" w:w="4320"/>
+            <w:tcW w:type="dxa" w:w="3744"/>
             <w:shd w:fill="F7F9FB"/>
             <w:tcMar>
               <w:top w:w="80" w:type="dxa"/>
@@ -4945,7 +5176,7 @@
                 <w:color w:val="222222"/>
                 <w:sz w:val="18"/>
               </w:rPr>
-              <w:t>Sum of Cash Balance + Current Market Value of Open Positions</w:t>
+              <w:t>Real-time equity base: Cash + Open Holdings Value (Dynamic)</w:t>
             </w:r>
           </w:p>
         </w:tc>
@@ -4978,7 +5209,7 @@
         </w:tc>
         <w:tc>
           <w:tcPr>
-            <w:tcW w:type="dxa" w:w="2592"/>
+            <w:tcW w:type="dxa" w:w="3168"/>
             <w:shd w:fill="FFFFFF"/>
             <w:tcMar>
               <w:top w:w="80" w:type="dxa"/>
@@ -4997,13 +5228,13 @@
                 <w:color w:val="222222"/>
                 <w:sz w:val="18"/>
               </w:rPr>
-              <w:t>₹1,000,000.00</w:t>
+              <w:t>₹100,000.00 (Active)</w:t>
             </w:r>
           </w:p>
         </w:tc>
         <w:tc>
           <w:tcPr>
-            <w:tcW w:type="dxa" w:w="4320"/>
+            <w:tcW w:type="dxa" w:w="3744"/>
             <w:shd w:fill="FFFFFF"/>
             <w:tcMar>
               <w:top w:w="80" w:type="dxa"/>
@@ -5049,13 +5280,13 @@
                 <w:color w:val="222222"/>
                 <w:sz w:val="18"/>
               </w:rPr>
-              <w:t>Risk Percent</w:t>
+              <w:t>Risk Percent / Percentage</w:t>
             </w:r>
           </w:p>
         </w:tc>
         <w:tc>
           <w:tcPr>
-            <w:tcW w:type="dxa" w:w="2592"/>
+            <w:tcW w:type="dxa" w:w="3168"/>
             <w:shd w:fill="F7F9FB"/>
             <w:tcMar>
               <w:top w:w="80" w:type="dxa"/>
@@ -5074,13 +5305,13 @@
                 <w:color w:val="222222"/>
                 <w:sz w:val="18"/>
               </w:rPr>
-              <w:t>0.01 (Sys 1) / 0.015 (Sys 2)</w:t>
+              <w:t>0.05 (Sys 1: 5.0%) / 0.075 (Sys 2: 7.5%)</w:t>
             </w:r>
           </w:p>
         </w:tc>
         <w:tc>
           <w:tcPr>
-            <w:tcW w:type="dxa" w:w="4320"/>
+            <w:tcW w:type="dxa" w:w="3744"/>
             <w:shd w:fill="F7F9FB"/>
             <w:tcMar>
               <w:top w:w="80" w:type="dxa"/>
@@ -5099,7 +5330,7 @@
                 <w:color w:val="222222"/>
                 <w:sz w:val="18"/>
               </w:rPr>
-              <w:t>Capital risk allocation percentage per individual trade setup</w:t>
+              <w:t>Active capital risk percentage per trade (dynamically read on every run)</w:t>
             </w:r>
           </w:p>
         </w:tc>
@@ -5132,7 +5363,7 @@
         </w:tc>
         <w:tc>
           <w:tcPr>
-            <w:tcW w:type="dxa" w:w="2592"/>
+            <w:tcW w:type="dxa" w:w="3168"/>
             <w:shd w:fill="FFFFFF"/>
             <w:tcMar>
               <w:top w:w="80" w:type="dxa"/>
@@ -5151,13 +5382,13 @@
                 <w:color w:val="222222"/>
                 <w:sz w:val="18"/>
               </w:rPr>
-              <w:t>₹1,000,000.00</w:t>
+              <w:t>₹100,000.00 (Active)</w:t>
             </w:r>
           </w:p>
         </w:tc>
         <w:tc>
           <w:tcPr>
-            <w:tcW w:type="dxa" w:w="4320"/>
+            <w:tcW w:type="dxa" w:w="3744"/>
             <w:shd w:fill="FFFFFF"/>
             <w:tcMar>
               <w:top w:w="80" w:type="dxa"/>
@@ -5176,7 +5407,7 @@
                 <w:color w:val="222222"/>
                 <w:sz w:val="18"/>
               </w:rPr>
-              <w:t>Baseline capital for Total Return %, CAGR %, and XIRR % calculations</w:t>
+              <w:t>Baseline reference for Total Return %, CAGR %, and XIRR % calculations</w:t>
             </w:r>
           </w:p>
         </w:tc>

</xml_diff>